<commit_message>
docs(srs): number job and API inventories 13 and 14 to match the team SRS
</commit_message>
<xml_diff>
--- a/docs/srs/SRS-G5-sua-doi-MBF-Job-API.docx
+++ b/docs/srs/SRS-G5-sua-doi-MBF-Job-API.docx
@@ -192,7 +192,7 @@
         <w:pStyle w:val="Compact"/>
       </w:pPr>
       <w:r>
-        <w:t xml:space="preserve">Số mục của phần II theo Mục lục SRS hiện tại:</w:t>
+        <w:t xml:space="preserve">Số mục của phần II theo bản SRS của nhóm:</w:t>
       </w:r>
       <w:r>
         <w:t xml:space="preserve"> </w:t>
@@ -202,10 +202,13 @@
           <w:bCs/>
           <w:b/>
         </w:rPr>
-        <w:t xml:space="preserve">16. Background Job Inventory</w:t>
-      </w:r>
-      <w:r>
-        <w:t xml:space="preserve">,</w:t>
+        <w:t xml:space="preserve">13. Background Job Inventory</w:t>
+      </w:r>
+      <w:r>
+        <w:t xml:space="preserve"> </w:t>
+      </w:r>
+      <w:r>
+        <w:t xml:space="preserve">(như bản SRS trong docs/srs-update),</w:t>
       </w:r>
       <w:r>
         <w:t xml:space="preserve"> </w:t>
@@ -215,7 +218,7 @@
           <w:bCs/>
           <w:b/>
         </w:rPr>
-        <w:t xml:space="preserve">17. External API Inventory</w:t>
+        <w:t xml:space="preserve">14. External API Inventory</w:t>
       </w:r>
       <w:r>
         <w:t xml:space="preserve">.</w:t>
@@ -583,7 +586,7 @@
               <w:jc w:val="left"/>
             </w:pPr>
             <w:r>
-              <w:t xml:space="preserve">Update CBR-42, CBR-56, GBR-04, GBR-11, UC-11, DBR-36, Entity OperatingHourException, JOB-04, JOB-08; rewrite Background Job Inventory (16) and External API Inventory (17)</w:t>
+              <w:t xml:space="preserve">Update CBR-42, CBR-56, GBR-04, GBR-11, UC-11, DBR-36, Entity OperatingHourException, JOB-04, JOB-08; rewrite Background Job Inventory (13) and External API Inventory (14)</w:t>
             </w:r>
           </w:p>
         </w:tc>
@@ -4920,13 +4923,13 @@
       </w:tr>
     </w:tbl>
     <w:bookmarkEnd w:id="47"/>
-    <w:bookmarkStart w:id="57" w:name="Xec19aefa3bbc75cbbcf729a9562558eceebb527"/>
+    <w:bookmarkStart w:id="57" w:name="X580eedaebcf33fb040b13ab7970412756147c36"/>
     <w:p>
       <w:pPr>
         <w:pStyle w:val="Heading1"/>
       </w:pPr>
       <w:r>
-        <w:t xml:space="preserve">H. Section II.16 Background Job Inventory — Thay toàn bộ</w:t>
+        <w:t xml:space="preserve">H. Section II.13 Background Job Inventory — Thay toàn bộ</w:t>
       </w:r>
     </w:p>
     <w:bookmarkStart w:id="48" w:name="common-behavior-for-all-jobs"/>
@@ -4935,7 +4938,7 @@
         <w:pStyle w:val="Heading2"/>
       </w:pPr>
       <w:r>
-        <w:t xml:space="preserve">16.0 Common behavior for all jobs</w:t>
+        <w:t xml:space="preserve">13.0 Common behavior for all jobs</w:t>
       </w:r>
     </w:p>
     <w:p>
@@ -5572,7 +5575,7 @@
         <w:pStyle w:val="Heading2"/>
       </w:pPr>
       <w:r>
-        <w:t xml:space="preserve">16.1 Resume Expired Membership Freezes (JOB-01)</w:t>
+        <w:t xml:space="preserve">13.1 Resume Expired Membership Freezes (JOB-01)</w:t>
       </w:r>
     </w:p>
     <w:p>
@@ -5887,7 +5890,7 @@
         <w:pStyle w:val="Heading2"/>
       </w:pPr>
       <w:r>
-        <w:t xml:space="preserve">16.2 Expire Membership and PT Packages (JOB-02)</w:t>
+        <w:t xml:space="preserve">13.2 Expire Membership and PT Packages (JOB-02)</w:t>
       </w:r>
     </w:p>
     <w:p>
@@ -6228,7 +6231,7 @@
         <w:pStyle w:val="Heading2"/>
       </w:pPr>
       <w:r>
-        <w:t xml:space="preserve">16.3 Expire Unused Day Passes (JOB-03)</w:t>
+        <w:t xml:space="preserve">13.3 Expire Unused Day Passes (JOB-03)</w:t>
       </w:r>
     </w:p>
     <w:p>
@@ -6545,7 +6548,7 @@
         <w:pStyle w:val="Heading2"/>
       </w:pPr>
       <w:r>
-        <w:t xml:space="preserve">16.4 Auto-Close PT Sessions (JOB-04)</w:t>
+        <w:t xml:space="preserve">13.4 Auto-Close PT Sessions (JOB-04)</w:t>
       </w:r>
     </w:p>
     <w:p>
@@ -6922,7 +6925,7 @@
         <w:pStyle w:val="Heading2"/>
       </w:pPr>
       <w:r>
-        <w:t xml:space="preserve">16.5 Cancel Overdue Online Orders (JOB-05)</w:t>
+        <w:t xml:space="preserve">13.5 Cancel Overdue Online Orders (JOB-05)</w:t>
       </w:r>
     </w:p>
     <w:p>
@@ -7265,7 +7268,7 @@
         <w:pStyle w:val="Heading2"/>
       </w:pPr>
       <w:r>
-        <w:t xml:space="preserve">16.6 Expire Timed-Out Payment Transactions (JOB-06)</w:t>
+        <w:t xml:space="preserve">13.6 Expire Timed-Out Payment Transactions (JOB-06)</w:t>
       </w:r>
     </w:p>
     <w:p>
@@ -7570,7 +7573,7 @@
         <w:pStyle w:val="Heading2"/>
       </w:pPr>
       <w:r>
-        <w:t xml:space="preserve">16.7 Remind Managers of Leave Requests Starting Tomorrow (JOB-07)</w:t>
+        <w:t xml:space="preserve">13.7 Remind Managers of Leave Requests Starting Tomorrow (JOB-07)</w:t>
       </w:r>
     </w:p>
     <w:p>
@@ -7879,7 +7882,7 @@
         <w:pStyle w:val="Heading2"/>
       </w:pPr>
       <w:r>
-        <w:t xml:space="preserve">16.8 Remind Customers Without Gym Access (JOB-08)</w:t>
+        <w:t xml:space="preserve">13.8 Remind Customers Without Gym Access (JOB-08)</w:t>
       </w:r>
     </w:p>
     <w:p>
@@ -8183,13 +8186,13 @@
     </w:tbl>
     <w:bookmarkEnd w:id="56"/>
     <w:bookmarkEnd w:id="57"/>
-    <w:bookmarkStart w:id="63" w:name="Xca66e722c19301392791588ea71d321f09b48d9"/>
+    <w:bookmarkStart w:id="63" w:name="Xf2034aa2adc3b317bd14516859a19467782fbac"/>
     <w:p>
       <w:pPr>
         <w:pStyle w:val="Heading1"/>
       </w:pPr>
       <w:r>
-        <w:t xml:space="preserve">I. Section II.17 External API Inventory — Thay toàn bộ</w:t>
+        <w:t xml:space="preserve">I. Section II.14 External API Inventory — Thay toàn bộ</w:t>
       </w:r>
     </w:p>
     <w:bookmarkStart w:id="58" w:name="vnpay-payment-request-api-01"/>
@@ -8198,7 +8201,7 @@
         <w:pStyle w:val="Heading2"/>
       </w:pPr>
       <w:r>
-        <w:t xml:space="preserve">17.1 VNPay Payment Request (API-01)</w:t>
+        <w:t xml:space="preserve">14.1 VNPay Payment Request (API-01)</w:t>
       </w:r>
     </w:p>
     <w:tbl>
@@ -8574,7 +8577,7 @@
         <w:pStyle w:val="Heading2"/>
       </w:pPr>
       <w:r>
-        <w:t xml:space="preserve">17.2 VNPay IPN Webhook (API-02)</w:t>
+        <w:t xml:space="preserve">14.2 VNPay IPN Webhook (API-02)</w:t>
       </w:r>
     </w:p>
     <w:tbl>
@@ -8953,7 +8956,7 @@
         <w:pStyle w:val="Heading2"/>
       </w:pPr>
       <w:r>
-        <w:t xml:space="preserve">17.3 Email Delivery (API-03)</w:t>
+        <w:t xml:space="preserve">14.3 Email Delivery (API-03)</w:t>
       </w:r>
     </w:p>
     <w:tbl>
@@ -9333,7 +9336,7 @@
         <w:pStyle w:val="Heading2"/>
       </w:pPr>
       <w:r>
-        <w:t xml:space="preserve">17.4 Weather Forecast (API-04)</w:t>
+        <w:t xml:space="preserve">14.4 Weather Forecast (API-04)</w:t>
       </w:r>
     </w:p>
     <w:tbl>
@@ -9632,7 +9635,7 @@
         <w:pStyle w:val="Heading2"/>
       </w:pPr>
       <w:r>
-        <w:t xml:space="preserve">17.5 Exercise Data (API-05)</w:t>
+        <w:t xml:space="preserve">14.5 Exercise Data (API-05)</w:t>
       </w:r>
     </w:p>
     <w:tbl>
@@ -10094,7 +10097,7 @@
               <w:jc w:val="left"/>
             </w:pPr>
             <w:r>
-              <w:t xml:space="preserve">16.2</w:t>
+              <w:t xml:space="preserve">13.2</w:t>
             </w:r>
           </w:p>
         </w:tc>
@@ -10153,7 +10156,7 @@
               <w:jc w:val="left"/>
             </w:pPr>
             <w:r>
-              <w:t xml:space="preserve">16.3</w:t>
+              <w:t xml:space="preserve">13.3</w:t>
             </w:r>
           </w:p>
         </w:tc>
@@ -10212,7 +10215,7 @@
               <w:jc w:val="left"/>
             </w:pPr>
             <w:r>
-              <w:t xml:space="preserve">16.4 bước 2a, CBR-56, CBR-124</w:t>
+              <w:t xml:space="preserve">13.4 bước 2a, CBR-56, CBR-124</w:t>
             </w:r>
           </w:p>
         </w:tc>

</xml_diff>

<commit_message>
docs(srs): keep counter single-session sale in the SRS (option b)
- BF-05 adds the counter branch A3 and updates trigger, pre-condition, E1, E2
- Entity Order: a counter single-session order uses the P-09 deadline
- JOB-05 also cancels overdue counter single-session orders
- Withdraw MSG135 and list the missing code as open items
</commit_message>
<xml_diff>
--- a/docs/srs/SRS-G5-sua-doi-MBF-Job-API.docx
+++ b/docs/srs/SRS-G5-sua-doi-MBF-Job-API.docx
@@ -785,7 +785,7 @@
                 <w:rFonts w:ascii="Calibri" w:hAnsi="Calibri" w:cs="Calibri" w:eastAsia="Calibri"/>
                 <w:sz w:val="22"/>
               </w:rPr>
-              <w:t>Update CBR-42, CBR-56, GBR-04, GBR-11, UC-11, DBR-36, Entity OperatingHourException, JOB-04, JOB-08; rewrite Background Job Inventory (16) and External API Inventory (17)</w:t>
+              <w:t>Update CBR-42, CBR-56, GBR-04, GBR-11, UC-11, DBR-36, Entity OperatingHourException, Entity Order, JOB-04, JOB-05, JOB-08; withdraw MSG135; rewrite Background Job Inventory (16) and External API Inventory (17)</w:t>
             </w:r>
           </w:p>
         </w:tc>
@@ -3033,7 +3033,7 @@
           <w:rFonts w:ascii="Calibri" w:hAnsi="Calibri" w:cs="Calibri" w:eastAsia="Calibri"/>
           <w:sz w:val="24"/>
         </w:rPr>
-        <w:t xml:space="preserve"> A customer wants one PT session and books it online.</w:t>
+        <w:t xml:space="preserve"> A customer wants one PT session and books it online, or asks for one at the counter (A3).</w:t>
       </w:r>
     </w:p>
     <w:p>
@@ -3053,7 +3053,7 @@
           <w:rFonts w:ascii="Calibri" w:hAnsi="Calibri" w:cs="Calibri" w:eastAsia="Calibri"/>
           <w:sz w:val="24"/>
         </w:rPr>
-        <w:t xml:space="preserve"> The customer is signed in with a Self profile.</w:t>
+        <w:t xml:space="preserve"> Online: the customer is signed in with a Self profile. At the counter: a Receptionist shift is open (CBR-105).</w:t>
       </w:r>
     </w:p>
     <w:p>
@@ -3348,19 +3348,6 @@
     </w:p>
     <w:p>
       <w:pPr>
-        <w:spacing w:after="120" w:before="0" w:line="276" w:lineRule="auto"/>
-      </w:pPr>
-      <w:r>
-        <w:rPr>
-          <w:rFonts w:ascii="Calibri" w:hAnsi="Calibri" w:cs="Calibri" w:eastAsia="Calibri"/>
-          <w:b/>
-          <w:sz w:val="24"/>
-        </w:rPr>
-        <w:t>Exception flows:</w:t>
-      </w:r>
-    </w:p>
-    <w:p>
-      <w:pPr>
         <w:tabs>
           <w:tab w:pos="510" w:val="left"/>
         </w:tabs>
@@ -3380,7 +3367,20 @@
           <w:rFonts w:ascii="Calibri" w:hAnsi="Calibri" w:cs="Calibri" w:eastAsia="Calibri"/>
           <w:sz w:val="24"/>
         </w:rPr>
-        <w:t>E1 – At step 1 the customer cannot use the gym on that date or is under P-05 (BR-72, CBR-60, CBR-15): booking is blocked. The flow ends.</w:t>
+        <w:t>A3 – At the start the customer is at the counter: the Receptionist sells a single session for today (UC-20): chooses the PT and a free slot today and finds or quick-creates the customer; a walk-in without a membership buys today's day pass first (CBR-60, BF-01). The system creates a Pending counter order and holds the slot until the payment deadline P-09, shown as an mm:ss countdown; the Receptionist collects cash or confirms the bank transfer in the open shift (CBR-54, CBR-49, CBR-77, CBR-105). Continues at step 5.</w:t>
+      </w:r>
+    </w:p>
+    <w:p>
+      <w:pPr>
+        <w:spacing w:after="120" w:before="0" w:line="276" w:lineRule="auto"/>
+      </w:pPr>
+      <w:r>
+        <w:rPr>
+          <w:rFonts w:ascii="Calibri" w:hAnsi="Calibri" w:cs="Calibri" w:eastAsia="Calibri"/>
+          <w:b/>
+          <w:sz w:val="24"/>
+        </w:rPr>
+        <w:t>Exception flows:</w:t>
       </w:r>
     </w:p>
     <w:p>
@@ -3404,7 +3404,31 @@
           <w:rFonts w:ascii="Calibri" w:hAnsi="Calibri" w:cs="Calibri" w:eastAsia="Calibri"/>
           <w:sz w:val="24"/>
         </w:rPr>
-        <w:t>E2 – In A1 the payment deadline passes: JOB-05 cancels the order (PaymentTimeout) and the slot returns to Free (CBR-70, DBR-36). The flow ends.</w:t>
+        <w:t>E1 – At step 1, or in A3, the customer cannot use the gym on that date or is under P-05 (BR-72, CBR-60, CBR-15): booking is blocked. The flow ends.</w:t>
+      </w:r>
+    </w:p>
+    <w:p>
+      <w:pPr>
+        <w:tabs>
+          <w:tab w:pos="510" w:val="left"/>
+        </w:tabs>
+        <w:spacing w:after="60" w:line="276" w:lineRule="auto"/>
+        <w:ind w:left="510" w:hanging="340"/>
+      </w:pPr>
+      <w:r>
+        <w:rPr>
+          <w:rFonts w:ascii="Calibri" w:hAnsi="Calibri" w:cs="Calibri" w:eastAsia="Calibri"/>
+          <w:sz w:val="24"/>
+        </w:rPr>
+        <w:t>•</w:t>
+        <w:tab/>
+      </w:r>
+      <w:r>
+        <w:rPr>
+          <w:rFonts w:ascii="Calibri" w:hAnsi="Calibri" w:cs="Calibri" w:eastAsia="Calibri"/>
+          <w:sz w:val="24"/>
+        </w:rPr>
+        <w:t>E2 – In A1, or in A3 before the money is collected, the payment deadline passes: JOB-05 cancels the order (PaymentTimeout) and the slot returns to Free (CBR-70, CBR-54, DBR-36). The flow ends.</w:t>
       </w:r>
     </w:p>
     <w:p>
@@ -6296,6 +6320,351 @@
         </w:rPr>
         <w:t>Apply date is unique — at most one exception per date; either closed all day (no times) or open with closing time after opening time. PT package sessions are still generated on a closed day; sessions on a closed day or outside the hours of the date are rescheduled by the PT (CBR-56, CBR-124). No new PT slot can be published and no check-in or shift can be opened on a closed day.</w:t>
       </w:r>
+    </w:p>
+    <w:p>
+      <w:pPr>
+        <w:pStyle w:val="Heading2"/>
+        <w:spacing w:before="200" w:after="120"/>
+      </w:pPr>
+      <w:r>
+        <w:rPr>
+          <w:rFonts w:ascii="Calibri" w:hAnsi="Calibri" w:cs="Calibri" w:eastAsia="Calibri"/>
+          <w:b/>
+          <w:color w:val="2E74B5"/>
+          <w:sz w:val="26"/>
+        </w:rPr>
+        <w:t>E9. Entity Order — Thay câu về hạn thanh toán trong dòng Business identity</w:t>
+      </w:r>
+    </w:p>
+    <w:p>
+      <w:pPr>
+        <w:spacing w:after="120" w:before="0" w:line="276" w:lineRule="auto"/>
+      </w:pPr>
+      <w:r>
+        <w:rPr>
+          <w:rFonts w:ascii="Calibri" w:hAnsi="Calibri" w:cs="Calibri" w:eastAsia="Calibri"/>
+          <w:sz w:val="24"/>
+        </w:rPr>
+        <w:t xml:space="preserve">Thay câu </w:t>
+      </w:r>
+      <w:r>
+        <w:rPr>
+          <w:rFonts w:ascii="Calibri" w:hAnsi="Calibri" w:cs="Calibri" w:eastAsia="Calibri"/>
+          <w:i/>
+          <w:sz w:val="24"/>
+        </w:rPr>
+        <w:t>"A Counter order has no payment deadline; a PT-sale order holds its slots for 15 minutes (BR-93) and is cancelled if not paid in time"</w:t>
+      </w:r>
+      <w:r>
+        <w:rPr>
+          <w:rFonts w:ascii="Calibri" w:hAnsi="Calibri" w:cs="Calibri" w:eastAsia="Calibri"/>
+          <w:sz w:val="24"/>
+        </w:rPr>
+        <w:t xml:space="preserve"> bằng:</w:t>
+      </w:r>
+    </w:p>
+    <w:p>
+      <w:pPr>
+        <w:spacing w:after="120" w:before="0" w:line="276" w:lineRule="auto"/>
+        <w:ind w:left="454"/>
+      </w:pPr>
+      <w:r>
+        <w:rPr>
+          <w:rFonts w:ascii="Calibri" w:hAnsi="Calibri" w:cs="Calibri" w:eastAsia="Calibri"/>
+          <w:sz w:val="24"/>
+        </w:rPr>
+        <w:t>A Counter order has no payment deadline, except a single-session order, which copies P-09 as the hold time of its slot and is cancelled by JOB-05 if not paid in time (CBR-54); a PT-sale order holds its slots for 15 minutes (BR-93) and is cancelled if not paid in time.</w:t>
+      </w:r>
+    </w:p>
+    <w:p>
+      <w:pPr>
+        <w:pStyle w:val="Heading2"/>
+        <w:spacing w:before="200" w:after="120"/>
+      </w:pPr>
+      <w:r>
+        <w:rPr>
+          <w:rFonts w:ascii="Calibri" w:hAnsi="Calibri" w:cs="Calibri" w:eastAsia="Calibri"/>
+          <w:b/>
+          <w:color w:val="2E74B5"/>
+          <w:sz w:val="26"/>
+        </w:rPr>
+        <w:t>E10. System Messages — Thay dòng MSG135</w:t>
+      </w:r>
+    </w:p>
+    <w:tbl>
+      <w:tblPr>
+        <w:tblW w:type="auto" w:w="0"/>
+        <w:tblLook w:firstColumn="1" w:firstRow="1" w:lastColumn="0" w:lastRow="0" w:noHBand="0" w:noVBand="1" w:val="04A0"/>
+        <w:tblW w:type="dxa" w:w="9360"/>
+        <w:tblBorders>
+          <w:top w:val="single" w:sz="4" w:color="000000"/>
+          <w:left w:val="single" w:sz="4" w:color="000000"/>
+          <w:bottom w:val="single" w:sz="4" w:color="000000"/>
+          <w:right w:val="single" w:sz="4" w:color="000000"/>
+          <w:insideH w:val="single" w:sz="4" w:color="000000"/>
+          <w:insideV w:val="single" w:sz="4" w:color="000000"/>
+        </w:tblBorders>
+        <w:tblLayout w:type="fixed"/>
+      </w:tblPr>
+      <w:tblGrid>
+        <w:gridCol w:w="1872"/>
+        <w:gridCol w:w="1872"/>
+        <w:gridCol w:w="1872"/>
+        <w:gridCol w:w="1872"/>
+        <w:gridCol w:w="1872"/>
+      </w:tblGrid>
+      <w:tr>
+        <w:trPr>
+          <w:tblHeader/>
+        </w:trPr>
+        <w:tc>
+          <w:tcPr>
+            <w:tcW w:type="dxa" w:w="1872"/>
+            <w:shd w:val="clear" w:color="auto" w:fill="E6B8AF"/>
+            <w:tcMar>
+              <w:top w:type="dxa" w:w="40"/>
+              <w:left w:type="dxa" w:w="100"/>
+              <w:bottom w:type="dxa" w:w="40"/>
+              <w:right w:type="dxa" w:w="100"/>
+            </w:tcMar>
+          </w:tcPr>
+          <w:p>
+            <w:pPr>
+              <w:spacing w:after="0" w:before="0" w:line="360" w:lineRule="auto"/>
+            </w:pPr>
+            <w:r>
+              <w:rPr>
+                <w:rFonts w:ascii="Calibri" w:hAnsi="Calibri" w:cs="Calibri" w:eastAsia="Calibri"/>
+                <w:b/>
+                <w:sz w:val="22"/>
+              </w:rPr>
+              <w:t>#</w:t>
+            </w:r>
+          </w:p>
+        </w:tc>
+        <w:tc>
+          <w:tcPr>
+            <w:tcW w:type="dxa" w:w="1872"/>
+            <w:shd w:val="clear" w:color="auto" w:fill="E6B8AF"/>
+            <w:tcMar>
+              <w:top w:type="dxa" w:w="40"/>
+              <w:left w:type="dxa" w:w="100"/>
+              <w:bottom w:type="dxa" w:w="40"/>
+              <w:right w:type="dxa" w:w="100"/>
+            </w:tcMar>
+          </w:tcPr>
+          <w:p>
+            <w:pPr>
+              <w:spacing w:after="0" w:before="0" w:line="360" w:lineRule="auto"/>
+            </w:pPr>
+            <w:r>
+              <w:rPr>
+                <w:rFonts w:ascii="Calibri" w:hAnsi="Calibri" w:cs="Calibri" w:eastAsia="Calibri"/>
+                <w:b/>
+                <w:sz w:val="22"/>
+              </w:rPr>
+              <w:t>Message code</w:t>
+            </w:r>
+          </w:p>
+        </w:tc>
+        <w:tc>
+          <w:tcPr>
+            <w:tcW w:type="dxa" w:w="1872"/>
+            <w:shd w:val="clear" w:color="auto" w:fill="E6B8AF"/>
+            <w:tcMar>
+              <w:top w:type="dxa" w:w="40"/>
+              <w:left w:type="dxa" w:w="100"/>
+              <w:bottom w:type="dxa" w:w="40"/>
+              <w:right w:type="dxa" w:w="100"/>
+            </w:tcMar>
+          </w:tcPr>
+          <w:p>
+            <w:pPr>
+              <w:spacing w:after="0" w:before="0" w:line="360" w:lineRule="auto"/>
+            </w:pPr>
+            <w:r>
+              <w:rPr>
+                <w:rFonts w:ascii="Calibri" w:hAnsi="Calibri" w:cs="Calibri" w:eastAsia="Calibri"/>
+                <w:b/>
+                <w:sz w:val="22"/>
+              </w:rPr>
+              <w:t>Message Type</w:t>
+            </w:r>
+          </w:p>
+        </w:tc>
+        <w:tc>
+          <w:tcPr>
+            <w:tcW w:type="dxa" w:w="1872"/>
+            <w:shd w:val="clear" w:color="auto" w:fill="E6B8AF"/>
+            <w:tcMar>
+              <w:top w:type="dxa" w:w="40"/>
+              <w:left w:type="dxa" w:w="100"/>
+              <w:bottom w:type="dxa" w:w="40"/>
+              <w:right w:type="dxa" w:w="100"/>
+            </w:tcMar>
+          </w:tcPr>
+          <w:p>
+            <w:pPr>
+              <w:spacing w:after="0" w:before="0" w:line="360" w:lineRule="auto"/>
+            </w:pPr>
+            <w:r>
+              <w:rPr>
+                <w:rFonts w:ascii="Calibri" w:hAnsi="Calibri" w:cs="Calibri" w:eastAsia="Calibri"/>
+                <w:b/>
+                <w:sz w:val="22"/>
+              </w:rPr>
+              <w:t>Context</w:t>
+            </w:r>
+          </w:p>
+        </w:tc>
+        <w:tc>
+          <w:tcPr>
+            <w:tcW w:type="dxa" w:w="1872"/>
+            <w:shd w:val="clear" w:color="auto" w:fill="E6B8AF"/>
+            <w:tcMar>
+              <w:top w:type="dxa" w:w="40"/>
+              <w:left w:type="dxa" w:w="100"/>
+              <w:bottom w:type="dxa" w:w="40"/>
+              <w:right w:type="dxa" w:w="100"/>
+            </w:tcMar>
+          </w:tcPr>
+          <w:p>
+            <w:pPr>
+              <w:spacing w:after="0" w:before="0" w:line="360" w:lineRule="auto"/>
+            </w:pPr>
+            <w:r>
+              <w:rPr>
+                <w:rFonts w:ascii="Calibri" w:hAnsi="Calibri" w:cs="Calibri" w:eastAsia="Calibri"/>
+                <w:b/>
+                <w:sz w:val="22"/>
+              </w:rPr>
+              <w:t>Content</w:t>
+            </w:r>
+          </w:p>
+        </w:tc>
+      </w:tr>
+      <w:tr>
+        <w:tc>
+          <w:tcPr>
+            <w:tcW w:type="dxa" w:w="1872"/>
+            <w:tcMar>
+              <w:top w:type="dxa" w:w="40"/>
+              <w:left w:type="dxa" w:w="100"/>
+              <w:bottom w:type="dxa" w:w="40"/>
+              <w:right w:type="dxa" w:w="100"/>
+            </w:tcMar>
+          </w:tcPr>
+          <w:p>
+            <w:pPr>
+              <w:spacing w:after="0" w:before="0" w:line="360" w:lineRule="auto"/>
+            </w:pPr>
+            <w:r>
+              <w:rPr>
+                <w:rFonts w:ascii="Calibri" w:hAnsi="Calibri" w:cs="Calibri" w:eastAsia="Calibri"/>
+                <w:sz w:val="22"/>
+              </w:rPr>
+              <w:t>135</w:t>
+            </w:r>
+          </w:p>
+        </w:tc>
+        <w:tc>
+          <w:tcPr>
+            <w:tcW w:type="dxa" w:w="1872"/>
+            <w:tcMar>
+              <w:top w:type="dxa" w:w="40"/>
+              <w:left w:type="dxa" w:w="100"/>
+              <w:bottom w:type="dxa" w:w="40"/>
+              <w:right w:type="dxa" w:w="100"/>
+            </w:tcMar>
+          </w:tcPr>
+          <w:p>
+            <w:pPr>
+              <w:spacing w:after="0" w:before="0" w:line="360" w:lineRule="auto"/>
+            </w:pPr>
+            <w:r>
+              <w:rPr>
+                <w:rFonts w:ascii="Calibri" w:hAnsi="Calibri" w:cs="Calibri" w:eastAsia="Calibri"/>
+                <w:sz w:val="22"/>
+              </w:rPr>
+              <w:t>MSG135</w:t>
+            </w:r>
+          </w:p>
+        </w:tc>
+        <w:tc>
+          <w:tcPr>
+            <w:tcW w:type="dxa" w:w="1872"/>
+            <w:tcMar>
+              <w:top w:type="dxa" w:w="40"/>
+              <w:left w:type="dxa" w:w="100"/>
+              <w:bottom w:type="dxa" w:w="40"/>
+              <w:right w:type="dxa" w:w="100"/>
+            </w:tcMar>
+          </w:tcPr>
+          <w:p>
+            <w:pPr>
+              <w:spacing w:after="0" w:before="0" w:line="360" w:lineRule="auto"/>
+            </w:pPr>
+            <w:r>
+              <w:rPr>
+                <w:rFonts w:ascii="Calibri" w:hAnsi="Calibri" w:cs="Calibri" w:eastAsia="Calibri"/>
+                <w:sz w:val="22"/>
+              </w:rPr>
+              <w:t>—</w:t>
+            </w:r>
+          </w:p>
+        </w:tc>
+        <w:tc>
+          <w:tcPr>
+            <w:tcW w:type="dxa" w:w="1872"/>
+            <w:tcMar>
+              <w:top w:type="dxa" w:w="40"/>
+              <w:left w:type="dxa" w:w="100"/>
+              <w:bottom w:type="dxa" w:w="40"/>
+              <w:right w:type="dxa" w:w="100"/>
+            </w:tcMar>
+          </w:tcPr>
+          <w:p>
+            <w:pPr>
+              <w:spacing w:after="0" w:before="0" w:line="360" w:lineRule="auto"/>
+            </w:pPr>
+            <w:r>
+              <w:rPr>
+                <w:rFonts w:ascii="Calibri" w:hAnsi="Calibri" w:cs="Calibri" w:eastAsia="Calibri"/>
+                <w:sz w:val="22"/>
+              </w:rPr>
+              <w:t>Withdrawn — selling a single PT session at the counter is part of UC-20 (CBR-54), so a message saying it is unavailable is not used.</w:t>
+            </w:r>
+          </w:p>
+        </w:tc>
+        <w:tc>
+          <w:tcPr>
+            <w:tcW w:type="dxa" w:w="1872"/>
+            <w:tcMar>
+              <w:top w:type="dxa" w:w="40"/>
+              <w:left w:type="dxa" w:w="100"/>
+              <w:bottom w:type="dxa" w:w="40"/>
+              <w:right w:type="dxa" w:w="100"/>
+            </w:tcMar>
+          </w:tcPr>
+          <w:p>
+            <w:pPr>
+              <w:spacing w:after="0" w:before="0" w:line="360" w:lineRule="auto"/>
+            </w:pPr>
+            <w:r>
+              <w:rPr>
+                <w:rFonts w:ascii="Calibri" w:hAnsi="Calibri" w:cs="Calibri" w:eastAsia="Calibri"/>
+                <w:sz w:val="22"/>
+              </w:rPr>
+              <w:t>—</w:t>
+            </w:r>
+          </w:p>
+        </w:tc>
+      </w:tr>
+    </w:tbl>
+    <w:p>
+      <w:pPr>
+        <w:spacing w:after="80" w:before="0" w:line="276" w:lineRule="auto"/>
+      </w:pPr>
     </w:p>
     <w:p>
       <w:pPr>
@@ -7520,7 +7889,7 @@
                 <w:rFonts w:ascii="Calibri" w:hAnsi="Calibri" w:cs="Calibri" w:eastAsia="Calibri"/>
                 <w:sz w:val="22"/>
               </w:rPr>
-              <w:t>Runs: every minute. Threshold: online order still Pending past the payment deadline stored on the order (creation + P-09, default 20 minutes) with no Success transaction. Result: order → Cancelled (PaymentTimeout); Pending transactions → Expired; voucher use returned; Held slot → Free; the customer is notified (CBR-70, BR-44).</w:t>
+              <w:t>Runs: every minute. Threshold: online order, or counter single-session order (CBR-54), still Pending past the payment deadline stored on the order (creation + P-09, default 20 minutes) with no Success transaction. Result: order → Cancelled (PaymentTimeout); Pending transactions → Expired; voucher use returned; Held slot → Free; the customer is notified (CBR-70, BR-44).</w:t>
             </w:r>
           </w:p>
         </w:tc>
@@ -11171,7 +11540,7 @@
           <w:rFonts w:ascii="Calibri" w:hAnsi="Calibri" w:cs="Calibri" w:eastAsia="Calibri"/>
           <w:sz w:val="24"/>
         </w:rPr>
-        <w:t xml:space="preserve"> Cancels online orders that were not paid by their payment deadline, so the held slot and the voucher use are released (CBR-70).</w:t>
+        <w:t xml:space="preserve"> Cancels online orders, and counter single-session orders, that were not paid by their payment deadline, so the held slot and the voucher use are released (CBR-70, CBR-54).</w:t>
       </w:r>
     </w:p>
     <w:p>
@@ -11191,7 +11560,7 @@
           <w:rFonts w:ascii="Calibri" w:hAnsi="Calibri" w:cs="Calibri" w:eastAsia="Calibri"/>
           <w:sz w:val="24"/>
         </w:rPr>
-        <w:t xml:space="preserve"> UC-22, UC-37, UC-PAY · Rules CBR-70, CBR-40, BR-44, DBR-36, DBR-43</w:t>
+        <w:t xml:space="preserve"> UC-20, UC-22, UC-37, UC-PAY · Rules CBR-70, CBR-54, CBR-40, BR-44, DBR-36, DBR-43</w:t>
       </w:r>
     </w:p>
     <w:p>
@@ -11247,7 +11616,7 @@
           <w:rFonts w:ascii="Calibri" w:hAnsi="Calibri" w:cs="Calibri" w:eastAsia="Calibri"/>
           <w:sz w:val="24"/>
         </w:rPr>
-        <w:t>Find online orders that are still Pending and whose PaymentDueAt is before now.</w:t>
+        <w:t>Find online orders, and counter single-session orders (CBR-54), that are still Pending and whose PaymentDueAt is before now. Other counter orders have no deadline and are never cancelled by this job.</w:t>
       </w:r>
     </w:p>
     <w:p>
@@ -11271,7 +11640,7 @@
           <w:rFonts w:ascii="Calibri" w:hAnsi="Calibri" w:cs="Calibri" w:eastAsia="Calibri"/>
           <w:sz w:val="24"/>
         </w:rPr>
-        <w:t>For each order, in its own transaction, lock the customer and then the order, and re-check that the order is still Pending, still overdue and has no Success transaction (the IPN may have arrived in between).</w:t>
+        <w:t>For each order, in its own transaction, lock the customer and then the order, and re-check that the order is still Pending, still overdue and has no Success transaction (the IPN or the Receptionist may have completed it in between).</w:t>
       </w:r>
     </w:p>
     <w:p>
@@ -11343,7 +11712,7 @@
           <w:rFonts w:ascii="Calibri" w:hAnsi="Calibri" w:cs="Calibri" w:eastAsia="Calibri"/>
           <w:sz w:val="24"/>
         </w:rPr>
-        <w:t>Write the audit line and send the customer a bell notification, in the same transaction.</w:t>
+        <w:t>Write the audit line and, if the customer's account is Active, send a bell notification, in the same transaction.</w:t>
       </w:r>
     </w:p>
     <w:p>
@@ -16635,6 +17004,208 @@
           </w:p>
         </w:tc>
       </w:tr>
+      <w:tr>
+        <w:tc>
+          <w:tcPr>
+            <w:tcW w:type="dxa" w:w="400"/>
+            <w:tcMar>
+              <w:top w:type="dxa" w:w="40"/>
+              <w:left w:type="dxa" w:w="100"/>
+              <w:bottom w:type="dxa" w:w="40"/>
+              <w:right w:type="dxa" w:w="100"/>
+            </w:tcMar>
+          </w:tcPr>
+          <w:p>
+            <w:pPr>
+              <w:spacing w:after="0" w:before="0" w:line="360" w:lineRule="auto"/>
+            </w:pPr>
+            <w:r>
+              <w:rPr>
+                <w:rFonts w:ascii="Calibri" w:hAnsi="Calibri" w:cs="Calibri" w:eastAsia="Calibri"/>
+                <w:sz w:val="22"/>
+              </w:rPr>
+              <w:t>8</w:t>
+            </w:r>
+          </w:p>
+        </w:tc>
+        <w:tc>
+          <w:tcPr>
+            <w:tcW w:type="dxa" w:w="1700"/>
+            <w:tcMar>
+              <w:top w:type="dxa" w:w="40"/>
+              <w:left w:type="dxa" w:w="100"/>
+              <w:bottom w:type="dxa" w:w="40"/>
+              <w:right w:type="dxa" w:w="100"/>
+            </w:tcMar>
+          </w:tcPr>
+          <w:p>
+            <w:pPr>
+              <w:spacing w:after="0" w:before="0" w:line="360" w:lineRule="auto"/>
+            </w:pPr>
+            <w:r>
+              <w:rPr>
+                <w:rFonts w:ascii="Calibri" w:hAnsi="Calibri" w:cs="Calibri" w:eastAsia="Calibri"/>
+                <w:sz w:val="22"/>
+              </w:rPr>
+              <w:t>Bán buổi PT lẻ tại quầy</w:t>
+            </w:r>
+          </w:p>
+        </w:tc>
+        <w:tc>
+          <w:tcPr>
+            <w:tcW w:type="dxa" w:w="4560"/>
+            <w:tcMar>
+              <w:top w:type="dxa" w:w="40"/>
+              <w:left w:type="dxa" w:w="100"/>
+              <w:bottom w:type="dxa" w:w="40"/>
+              <w:right w:type="dxa" w:w="100"/>
+            </w:tcMar>
+          </w:tcPr>
+          <w:p>
+            <w:pPr>
+              <w:spacing w:after="0" w:before="0" w:line="360" w:lineRule="auto"/>
+            </w:pPr>
+            <w:r>
+              <w:rPr>
+                <w:rFonts w:ascii="Consolas" w:hAnsi="Consolas" w:cs="Consolas" w:eastAsia="Consolas"/>
+                <w:sz w:val="20"/>
+              </w:rPr>
+              <w:t>CounterSaleService.java:562</w:t>
+            </w:r>
+            <w:r>
+              <w:rPr>
+                <w:rFonts w:ascii="Calibri" w:hAnsi="Calibri" w:cs="Calibri" w:eastAsia="Calibri"/>
+                <w:sz w:val="22"/>
+              </w:rPr>
+              <w:t xml:space="preserve"> từ chối và trả MSG135 "Chưa có màn bán buổi PT lẻ tại quầy"</w:t>
+            </w:r>
+          </w:p>
+        </w:tc>
+        <w:tc>
+          <w:tcPr>
+            <w:tcW w:type="dxa" w:w="2700"/>
+            <w:tcMar>
+              <w:top w:type="dxa" w:w="40"/>
+              <w:left w:type="dxa" w:w="100"/>
+              <w:bottom w:type="dxa" w:w="40"/>
+              <w:right w:type="dxa" w:w="100"/>
+            </w:tcMar>
+          </w:tcPr>
+          <w:p>
+            <w:pPr>
+              <w:spacing w:after="0" w:before="0" w:line="360" w:lineRule="auto"/>
+            </w:pPr>
+            <w:r>
+              <w:rPr>
+                <w:rFonts w:ascii="Calibri" w:hAnsi="Calibri" w:cs="Calibri" w:eastAsia="Calibri"/>
+                <w:sz w:val="22"/>
+              </w:rPr>
+              <w:t>UC-20, CBR-54, CBR-49, CBR-60; BF-05 A3. MSG135 rút khỏi SRS (E10)</w:t>
+            </w:r>
+          </w:p>
+        </w:tc>
+      </w:tr>
+      <w:tr>
+        <w:tc>
+          <w:tcPr>
+            <w:tcW w:type="dxa" w:w="400"/>
+            <w:tcMar>
+              <w:top w:type="dxa" w:w="40"/>
+              <w:left w:type="dxa" w:w="100"/>
+              <w:bottom w:type="dxa" w:w="40"/>
+              <w:right w:type="dxa" w:w="100"/>
+            </w:tcMar>
+          </w:tcPr>
+          <w:p>
+            <w:pPr>
+              <w:spacing w:after="0" w:before="0" w:line="360" w:lineRule="auto"/>
+            </w:pPr>
+            <w:r>
+              <w:rPr>
+                <w:rFonts w:ascii="Calibri" w:hAnsi="Calibri" w:cs="Calibri" w:eastAsia="Calibri"/>
+                <w:sz w:val="22"/>
+              </w:rPr>
+              <w:t>9</w:t>
+            </w:r>
+          </w:p>
+        </w:tc>
+        <w:tc>
+          <w:tcPr>
+            <w:tcW w:type="dxa" w:w="1700"/>
+            <w:tcMar>
+              <w:top w:type="dxa" w:w="40"/>
+              <w:left w:type="dxa" w:w="100"/>
+              <w:bottom w:type="dxa" w:w="40"/>
+              <w:right w:type="dxa" w:w="100"/>
+            </w:tcMar>
+          </w:tcPr>
+          <w:p>
+            <w:pPr>
+              <w:spacing w:after="0" w:before="0" w:line="360" w:lineRule="auto"/>
+            </w:pPr>
+            <w:r>
+              <w:rPr>
+                <w:rFonts w:ascii="Calibri" w:hAnsi="Calibri" w:cs="Calibri" w:eastAsia="Calibri"/>
+                <w:sz w:val="22"/>
+              </w:rPr>
+              <w:t>JOB-05 với đơn buổi lẻ tại quầy</w:t>
+            </w:r>
+          </w:p>
+        </w:tc>
+        <w:tc>
+          <w:tcPr>
+            <w:tcW w:type="dxa" w:w="4560"/>
+            <w:tcMar>
+              <w:top w:type="dxa" w:w="40"/>
+              <w:left w:type="dxa" w:w="100"/>
+              <w:bottom w:type="dxa" w:w="40"/>
+              <w:right w:type="dxa" w:w="100"/>
+            </w:tcMar>
+          </w:tcPr>
+          <w:p>
+            <w:pPr>
+              <w:spacing w:after="0" w:before="0" w:line="360" w:lineRule="auto"/>
+            </w:pPr>
+            <w:r>
+              <w:rPr>
+                <w:rFonts w:ascii="Consolas" w:hAnsi="Consolas" w:cs="Consolas" w:eastAsia="Consolas"/>
+                <w:sz w:val="20"/>
+              </w:rPr>
+              <w:t>CancelOverdueOnlineOrdersJob</w:t>
+            </w:r>
+            <w:r>
+              <w:rPr>
+                <w:rFonts w:ascii="Calibri" w:hAnsi="Calibri" w:cs="Calibri" w:eastAsia="Calibri"/>
+                <w:sz w:val="22"/>
+              </w:rPr>
+              <w:t xml:space="preserve"> chỉ hủy đơn online</w:t>
+            </w:r>
+          </w:p>
+        </w:tc>
+        <w:tc>
+          <w:tcPr>
+            <w:tcW w:type="dxa" w:w="2700"/>
+            <w:tcMar>
+              <w:top w:type="dxa" w:w="40"/>
+              <w:left w:type="dxa" w:w="100"/>
+              <w:bottom w:type="dxa" w:w="40"/>
+              <w:right w:type="dxa" w:w="100"/>
+            </w:tcMar>
+          </w:tcPr>
+          <w:p>
+            <w:pPr>
+              <w:spacing w:after="0" w:before="0" w:line="360" w:lineRule="auto"/>
+            </w:pPr>
+            <w:r>
+              <w:rPr>
+                <w:rFonts w:ascii="Calibri" w:hAnsi="Calibri" w:cs="Calibri" w:eastAsia="Calibri"/>
+                <w:sz w:val="22"/>
+              </w:rPr>
+              <w:t>16.5, CBR-54, Entity Order (E9)</w:t>
+            </w:r>
+          </w:p>
+        </w:tc>
+      </w:tr>
     </w:tbl>
     <w:p>
       <w:pPr>
@@ -16653,7 +17224,61 @@
           <w:color w:val="2E74B5"/>
           <w:sz w:val="26"/>
         </w:rPr>
-        <w:t>Z2. Mâu thuẫn trong SRS cần nhóm chốt: bán buổi PT lẻ tại quầy</w:t>
+        <w:t>Z2. Đã chốt: bán buổi PT lẻ tại quầy — hướng (b)</w:t>
+      </w:r>
+    </w:p>
+    <w:p>
+      <w:pPr>
+        <w:spacing w:after="120" w:before="0" w:line="276" w:lineRule="auto"/>
+      </w:pPr>
+      <w:r>
+        <w:rPr>
+          <w:rFonts w:ascii="Calibri" w:hAnsi="Calibri" w:cs="Calibri" w:eastAsia="Calibri"/>
+          <w:sz w:val="24"/>
+        </w:rPr>
+        <w:t xml:space="preserve">Nhóm chọn </w:t>
+      </w:r>
+      <w:r>
+        <w:rPr>
+          <w:rFonts w:ascii="Calibri" w:hAnsi="Calibri" w:cs="Calibri" w:eastAsia="Calibri"/>
+          <w:b/>
+          <w:sz w:val="24"/>
+        </w:rPr>
+        <w:t>giữ SRS</w:t>
+      </w:r>
+      <w:r>
+        <w:rPr>
+          <w:rFonts w:ascii="Calibri" w:hAnsi="Calibri" w:cs="Calibri" w:eastAsia="Calibri"/>
+          <w:sz w:val="24"/>
+        </w:rPr>
+        <w:t xml:space="preserve">: lễ tân vẫn bán buổi PT lẻ trong ngày tại quầy (UC-20, CBR-49, CBR-54, CBR-60, CBR-32). Đây là </w:t>
+      </w:r>
+      <w:r>
+        <w:rPr>
+          <w:rFonts w:ascii="Calibri" w:hAnsi="Calibri" w:cs="Calibri" w:eastAsia="Calibri"/>
+          <w:b/>
+          <w:sz w:val="24"/>
+        </w:rPr>
+        <w:t>chức năng chưa làm</w:t>
+      </w:r>
+      <w:r>
+        <w:rPr>
+          <w:rFonts w:ascii="Calibri" w:hAnsi="Calibri" w:cs="Calibri" w:eastAsia="Calibri"/>
+          <w:sz w:val="24"/>
+        </w:rPr>
+        <w:t xml:space="preserve"> (Z1 dòng 8, 9).</w:t>
+      </w:r>
+    </w:p>
+    <w:p>
+      <w:pPr>
+        <w:spacing w:after="120" w:before="0" w:line="276" w:lineRule="auto"/>
+      </w:pPr>
+      <w:r>
+        <w:rPr>
+          <w:rFonts w:ascii="Calibri" w:hAnsi="Calibri" w:cs="Calibri" w:eastAsia="Calibri"/>
+          <w:sz w:val="24"/>
+        </w:rPr>
+        <w:t>Để SRS không tự mâu thuẫn, file này đã sửa sẵn:</w:t>
       </w:r>
     </w:p>
     <w:p>
@@ -16677,7 +17302,22 @@
           <w:rFonts w:ascii="Calibri" w:hAnsi="Calibri" w:cs="Calibri" w:eastAsia="Calibri"/>
           <w:sz w:val="24"/>
         </w:rPr>
-        <w:t>SRS nói lễ tân bán buổi PT lẻ tại quầy: UC-20, CBR-49, CBR-54, CBR-60, CBR-32.</w:t>
+        <w:t xml:space="preserve">BF-05 thêm nhánh </w:t>
+      </w:r>
+      <w:r>
+        <w:rPr>
+          <w:rFonts w:ascii="Calibri" w:hAnsi="Calibri" w:cs="Calibri" w:eastAsia="Calibri"/>
+          <w:b/>
+          <w:sz w:val="24"/>
+        </w:rPr>
+        <w:t>A3</w:t>
+      </w:r>
+      <w:r>
+        <w:rPr>
+          <w:rFonts w:ascii="Calibri" w:hAnsi="Calibri" w:cs="Calibri" w:eastAsia="Calibri"/>
+          <w:sz w:val="24"/>
+        </w:rPr>
+        <w:t xml:space="preserve"> (bán tại quầy), sửa Trigger, Pre-condition, E1, E2.</w:t>
       </w:r>
     </w:p>
     <w:p>
@@ -16701,21 +17341,7 @@
           <w:rFonts w:ascii="Calibri" w:hAnsi="Calibri" w:cs="Calibri" w:eastAsia="Calibri"/>
           <w:sz w:val="24"/>
         </w:rPr>
-        <w:t xml:space="preserve">Code từ chối việc này: </w:t>
-      </w:r>
-      <w:r>
-        <w:rPr>
-          <w:rFonts w:ascii="Consolas" w:hAnsi="Consolas" w:cs="Consolas" w:eastAsia="Consolas"/>
-          <w:sz w:val="22"/>
-        </w:rPr>
-        <w:t>CounterSaleService.java:562</w:t>
-      </w:r>
-      <w:r>
-        <w:rPr>
-          <w:rFonts w:ascii="Calibri" w:hAnsi="Calibri" w:cs="Calibri" w:eastAsia="Calibri"/>
-          <w:sz w:val="24"/>
-        </w:rPr>
-        <w:t xml:space="preserve"> trả MSG135 "Chưa có màn bán buổi PT lẻ tại quầy".</w:t>
+        <w:t>Entity Order (E9): đơn buổi lẻ tại quầy có hạn thanh toán P-09.</w:t>
       </w:r>
     </w:p>
     <w:p>
@@ -16739,19 +17365,31 @@
           <w:rFonts w:ascii="Calibri" w:hAnsi="Calibri" w:cs="Calibri" w:eastAsia="Calibri"/>
           <w:sz w:val="24"/>
         </w:rPr>
-        <w:t>BF-05 hiện chỉ vẽ nhánh online.</w:t>
+        <w:t>JOB-05 (bảng 5.3 và mục 16.5) hủy cả đơn buổi lẻ tại quầy quá hạn.</w:t>
       </w:r>
     </w:p>
     <w:p>
       <w:pPr>
-        <w:spacing w:after="120" w:before="0" w:line="276" w:lineRule="auto"/>
-      </w:pPr>
-      <w:r>
-        <w:rPr>
-          <w:rFonts w:ascii="Calibri" w:hAnsi="Calibri" w:cs="Calibri" w:eastAsia="Calibri"/>
-          <w:sz w:val="24"/>
-        </w:rPr>
-        <w:t>Hai hướng: (a) bỏ bán buổi lẻ tại quầy khỏi SRS (rút CBR-54, sửa UC-20, CBR-49, CBR-60, CBR-32), hoặc (b) giữ SRS và ghi đây là chức năng chưa làm. Nhóm chọn xong thì sửa đúng các rule trên.</w:t>
+        <w:tabs>
+          <w:tab w:pos="510" w:val="left"/>
+        </w:tabs>
+        <w:spacing w:after="60" w:line="276" w:lineRule="auto"/>
+        <w:ind w:left="510" w:hanging="340"/>
+      </w:pPr>
+      <w:r>
+        <w:rPr>
+          <w:rFonts w:ascii="Calibri" w:hAnsi="Calibri" w:cs="Calibri" w:eastAsia="Calibri"/>
+          <w:sz w:val="24"/>
+        </w:rPr>
+        <w:t>•</w:t>
+        <w:tab/>
+      </w:r>
+      <w:r>
+        <w:rPr>
+          <w:rFonts w:ascii="Calibri" w:hAnsi="Calibri" w:cs="Calibri" w:eastAsia="Calibri"/>
+          <w:sz w:val="24"/>
+        </w:rPr>
+        <w:t>MSG135 rút khỏi SRS (E10), vì message này nói chức năng không có.</w:t>
       </w:r>
     </w:p>
     <w:p>

</xml_diff>